<commit_message>
feat: add two-player cooperative campaign and verified 0.4.0 delivery
</commit_message>
<xml_diff>
--- a/output/legal/incense-debt-privacy-policy-2026-10-11.docx
+++ b/output/legal/incense-debt-privacy-policy-2026-10-11.docx
@@ -44,26 +44,26 @@
           <w:rFonts w:ascii="Times New Roman" w:hAnsi="Times New Roman" w:eastAsia="华文仿宋" w:cs="Times New Roman"/>
           <w:color w:val="000000"/>
         </w:rPr>
-        <w:t xml:space="preserve">1. 《香火债》可离线单人游玩，也提供由您主动连接的双人对灯模式。无需手机号或实名注册。Android 0.3.0 申请联网和振动普通权限；离线模式不会自动上传愿簿、成就或单人进度。</w:t>
-      </w:r>
-    </w:p>
-    <w:p>
-      <w:pPr>
-        <w:adjustRightInd w:val="0"/>
-        <w:snapToGrid w:val="0"/>
-        <w:spacing w:before="0" w:after="156" w:afterLines="50" w:line="360" w:lineRule="auto"/>
-        <w:rPr>
-          <w:rFonts w:ascii="Times New Roman" w:hAnsi="Times New Roman" w:eastAsia="华文仿宋" w:cs="Times New Roman"/>
-          <w:color w:val="000000"/>
-        </w:rPr>
-        <w:widowControl w:val="1"/>
-      </w:pPr>
-      <w:r>
-        <w:rPr>
-          <w:rFonts w:ascii="Times New Roman" w:hAnsi="Times New Roman" w:eastAsia="华文仿宋" w:cs="Times New Roman"/>
-          <w:color w:val="000000"/>
-        </w:rPr>
-        <w:t xml:space="preserve">2. 首次连接每个服务器前，游戏说明信息处理范围并由您确认。对灯会向您选择的服务器发送匿名联机身份、昵称、配装、房间及操作信息，用于匹配、对战裁定、断线恢复和战绩。对手可看到昵称、配装及对局状态；请勿填写真实身份信息。</w:t>
+        <w:t xml:space="preserve">1. 《香火债》可离线单人游玩，也提供由您主动连接的双人合作闯关及联机切磋模式。无需手机号或实名注册。Android 0.4.0 申请联网和振动普通权限；离线模式不会自动上传愿簿、成就或单人进度。</w:t>
+      </w:r>
+    </w:p>
+    <w:p>
+      <w:pPr>
+        <w:adjustRightInd w:val="0"/>
+        <w:snapToGrid w:val="0"/>
+        <w:spacing w:before="0" w:after="156" w:afterLines="50" w:line="360" w:lineRule="auto"/>
+        <w:rPr>
+          <w:rFonts w:ascii="Times New Roman" w:hAnsi="Times New Roman" w:eastAsia="华文仿宋" w:cs="Times New Roman"/>
+          <w:color w:val="000000"/>
+        </w:rPr>
+        <w:widowControl w:val="1"/>
+      </w:pPr>
+      <w:r>
+        <w:rPr>
+          <w:rFonts w:ascii="Times New Roman" w:hAnsi="Times New Roman" w:eastAsia="华文仿宋" w:cs="Times New Roman"/>
+          <w:color w:val="000000"/>
+        </w:rPr>
+        <w:t xml:space="preserve">2. 首次连接每个服务器前，游戏说明信息处理范围并由您确认。联机会向您选择的服务器发送匿名联机身份、昵称、配装、房间及操作信息，用于匹配、战斗裁定、断线恢复和战绩。队友或对手可看到昵称、配装及对局状态；请勿填写真实身份信息。</w:t>
       </w:r>
     </w:p>
     <w:p>
@@ -250,7 +250,7 @@
           <w:rFonts w:ascii="Times New Roman" w:hAnsi="Times New Roman" w:eastAsia="华文仿宋" w:cs="Times New Roman"/>
           <w:color w:val="000000"/>
         </w:rPr>
-        <w:t xml:space="preserve">政策版本：1.4；适用范围：Windows 与 Android 客户端 0.3.0 的离线模式和可选对灯联机模式，以及本隐私政策展示网页；旧版离线客户端请参阅历史政策。</w:t>
+        <w:t xml:space="preserve">政策版本：1.5；适用范围：Windows 与 Android 客户端 0.4.0 的离线模式、可选共灯合作闯关和对灯切磋模式，以及本隐私政策展示网页；旧版客户端请参阅对应历史政策。</w:t>
       </w:r>
     </w:p>
     <w:p>
@@ -603,7 +603,7 @@
           <w:rFonts w:ascii="Times New Roman" w:hAnsi="Times New Roman" w:eastAsia="华文仿宋" w:cs="Times New Roman"/>
           <w:color w:val="000000"/>
         </w:rPr>
-        <w:t xml:space="preserve">离线功能没有手机号注册、实名认证、云存档、在线排行榜、内购支付或广告。可选对灯模式使用随机生成的匿名身份，不要求真实姓名或联系方式。客户端不收集或上传身份证号码、通讯录、精确位置、相机或麦克风内容、广告标识符或设备唯一标识符；单人愿簿、成就与成长不因联机自动上传。</w:t>
+        <w:t xml:space="preserve">离线功能没有手机号注册、实名认证、云存档、在线排行榜、内购支付或广告。可选联机模式使用随机生成的匿名身份，不要求真实姓名或联系方式。客户端不收集或上传身份证号码、通讯录、精确位置、相机或麦克风内容、广告标识符或设备唯一标识符；单人愿簿、成就与成长不因联机自动上传。</w:t>
       </w:r>
     </w:p>
     <w:p>
@@ -728,7 +728,7 @@
           <w:rFonts w:ascii="Times New Roman" w:hAnsi="Times New Roman" w:eastAsia="华文仿宋" w:cs="Times New Roman"/>
           <w:color w:val="000000"/>
         </w:rPr>
-        <w:t xml:space="preserve">Android 0.3.0 声明联网和振动普通权限，没有定位、通讯录、相机、麦克风、照片或广泛外部存储权限。联网仅在您进入对灯并主动连接所选服务器时用于该功能；拒绝连接不影响离线模式。剪贴板和文件选择不等同于申请 Android 危险权限。</w:t>
+        <w:t xml:space="preserve">Android 0.4.0 声明联网和振动普通权限，没有定位、通讯录、相机、麦克风、照片或广泛外部存储权限。联网仅在您进入联机并主动连接所选服务器时用于该功能；拒绝连接不影响离线模式。剪贴板和文件选择不等同于申请 Android 危险权限。</w:t>
       </w:r>
     </w:p>
     <w:tbl>
@@ -1606,7 +1606,7 @@
                 <w:b w:val="0"/>
                 <w:bCs w:val="0"/>
               </w:rPr>
-              <w:t>对灯匹配、房间、实时对战和重连</w:t>
+              <w:t>联机匹配、房间、合作闯关或对战和重连</w:t>
             </w:r>
           </w:p>
         </w:tc>
@@ -1689,7 +1689,7 @@
                 <w:b w:val="0"/>
                 <w:bCs w:val="0"/>
               </w:rPr>
-              <w:t>不连接或退出对灯；可继续离线游玩</w:t>
+              <w:t>不连接或退出联机；可继续离线游玩</w:t>
             </w:r>
           </w:p>
         </w:tc>
@@ -1896,64 +1896,64 @@
           <w:kern w:val="0"/>
           <w:color w:val="000000"/>
         </w:rPr>
-        <w:t xml:space="preserve">（五）您主动连接对灯服务器</w:t>
-      </w:r>
-    </w:p>
-    <w:p>
-      <w:pPr>
-        <w:adjustRightInd w:val="0"/>
-        <w:snapToGrid w:val="0"/>
-        <w:spacing w:before="0" w:after="156" w:afterLines="50" w:line="360" w:lineRule="auto"/>
-        <w:rPr>
-          <w:rFonts w:ascii="Times New Roman" w:hAnsi="Times New Roman" w:eastAsia="华文仿宋" w:cs="Times New Roman"/>
-          <w:color w:val="000000"/>
-        </w:rPr>
-        <w:widowControl w:val="1"/>
-      </w:pPr>
-      <w:r>
-        <w:rPr>
-          <w:rFonts w:ascii="Times New Roman" w:hAnsi="Times New Roman" w:eastAsia="华文仿宋" w:cs="Times New Roman"/>
-          <w:color w:val="000000"/>
-        </w:rPr>
-        <w:t xml:space="preserve">客户端默认地址为本机测试地址，您可以填写自己或他人提供的服务器地址。同一比赛的两人需连接同一服务器。首次连接该地址前，客户端展示地址和信息处理范围，由您确认后连接；返回可取消。当前不提供预设的公共联机运营服务器。您选择其他运营者的服务时，请核对其主体、地区、隐私政策与联系方式。</w:t>
-      </w:r>
-    </w:p>
-    <w:p>
-      <w:pPr>
-        <w:adjustRightInd w:val="0"/>
-        <w:snapToGrid w:val="0"/>
-        <w:spacing w:before="0" w:after="156" w:afterLines="50" w:line="360" w:lineRule="auto"/>
-        <w:rPr>
-          <w:rFonts w:ascii="Times New Roman" w:hAnsi="Times New Roman" w:eastAsia="华文仿宋" w:cs="Times New Roman"/>
-          <w:color w:val="000000"/>
-        </w:rPr>
-        <w:widowControl w:val="1"/>
-      </w:pPr>
-      <w:r>
-        <w:rPr>
-          <w:rFonts w:ascii="Times New Roman" w:hAnsi="Times New Roman" w:eastAsia="华文仿宋" w:cs="Times New Roman"/>
-          <w:color w:val="000000"/>
-        </w:rPr>
-        <w:t xml:space="preserve">服务器在连接期间接收连接 IP，以及协议和游戏内容版本、随机匿名身份、昵称（最多 16 字符）、还愿人／武器／技能配装、匹配或六位房间码、准备和选择请求、移动／瞄准／开火／技能操作、心跳和事件确认。服务器据此计算位置、伤害、构筑、回合与结果，并保存恢复对局所需的状态及胜负计数。它不接收您的离线愿簿或文件目录。</w:t>
-      </w:r>
-    </w:p>
-    <w:p>
-      <w:pPr>
-        <w:adjustRightInd w:val="0"/>
-        <w:snapToGrid w:val="0"/>
-        <w:spacing w:before="0" w:after="156" w:afterLines="50" w:line="360" w:lineRule="auto"/>
-        <w:rPr>
-          <w:rFonts w:ascii="Times New Roman" w:hAnsi="Times New Roman" w:eastAsia="华文仿宋" w:cs="Times New Roman"/>
-          <w:color w:val="000000"/>
-        </w:rPr>
-        <w:widowControl w:val="1"/>
-      </w:pPr>
-      <w:r>
-        <w:rPr>
-          <w:rFonts w:ascii="Times New Roman" w:hAnsi="Times New Roman" w:eastAsia="华文仿宋" w:cs="Times New Roman"/>
-          <w:color w:val="000000"/>
-        </w:rPr>
-        <w:t xml:space="preserve">匿名恢复凭据在本机独立保存，服务器保存其摘要以恢复身份；六位房间码只用于找到房间，不是身份验证凭据。当前服务端代码不将 IP 或完整操作轨迹写入持久日志，不提供聊天、语音、通讯录、广告分析或在线排行榜。对手会收到您的昵称、配装、当前构筑、位置、攻击、血量及本场比分，不会收到恢复凭据或您的离线存档。运营者另行配置的网络代理日志以其说明为准。</w:t>
+        <w:t xml:space="preserve">（五）您主动连接联机服务器</w:t>
+      </w:r>
+    </w:p>
+    <w:p>
+      <w:pPr>
+        <w:adjustRightInd w:val="0"/>
+        <w:snapToGrid w:val="0"/>
+        <w:spacing w:before="0" w:after="156" w:afterLines="50" w:line="360" w:lineRule="auto"/>
+        <w:rPr>
+          <w:rFonts w:ascii="Times New Roman" w:hAnsi="Times New Roman" w:eastAsia="华文仿宋" w:cs="Times New Roman"/>
+          <w:color w:val="000000"/>
+        </w:rPr>
+        <w:widowControl w:val="1"/>
+      </w:pPr>
+      <w:r>
+        <w:rPr>
+          <w:rFonts w:ascii="Times New Roman" w:hAnsi="Times New Roman" w:eastAsia="华文仿宋" w:cs="Times New Roman"/>
+          <w:color w:val="000000"/>
+        </w:rPr>
+        <w:t xml:space="preserve">客户端默认地址为本机测试地址，您可以填写自己或他人提供的服务器地址。同一联机房间的两人需连接同一服务器。首次连接该地址前，客户端展示地址和信息处理范围，由您确认后连接；返回可取消。当前不提供预设的公共联机运营服务器。您选择其他运营者的服务时，请核对其主体、地区、隐私政策与联系方式。</w:t>
+      </w:r>
+    </w:p>
+    <w:p>
+      <w:pPr>
+        <w:adjustRightInd w:val="0"/>
+        <w:snapToGrid w:val="0"/>
+        <w:spacing w:before="0" w:after="156" w:afterLines="50" w:line="360" w:lineRule="auto"/>
+        <w:rPr>
+          <w:rFonts w:ascii="Times New Roman" w:hAnsi="Times New Roman" w:eastAsia="华文仿宋" w:cs="Times New Roman"/>
+          <w:color w:val="000000"/>
+        </w:rPr>
+        <w:widowControl w:val="1"/>
+      </w:pPr>
+      <w:r>
+        <w:rPr>
+          <w:rFonts w:ascii="Times New Roman" w:hAnsi="Times New Roman" w:eastAsia="华文仿宋" w:cs="Times New Roman"/>
+          <w:color w:val="000000"/>
+        </w:rPr>
+        <w:t xml:space="preserve">服务器接收连接 IP、协议和内容版本、匿名身份、昵称（最多 16 字符）、角色／武器／技能配装、玩法模式、匹配或六位房间码、准备与成长选择、移动／瞄准／开火／技能／拾取和救援操作、心跳与事件确认，用于计算共享地图、怪物、掉落、金币、位置、伤害、个人构筑、救援、楼层或回合及结果。它保存恢复所需状态，分别记录合作结果和对战胜负计数，不接收您的离线愿簿或文件目录。</w:t>
+      </w:r>
+    </w:p>
+    <w:p>
+      <w:pPr>
+        <w:adjustRightInd w:val="0"/>
+        <w:snapToGrid w:val="0"/>
+        <w:spacing w:before="0" w:after="156" w:afterLines="50" w:line="360" w:lineRule="auto"/>
+        <w:rPr>
+          <w:rFonts w:ascii="Times New Roman" w:hAnsi="Times New Roman" w:eastAsia="华文仿宋" w:cs="Times New Roman"/>
+          <w:color w:val="000000"/>
+        </w:rPr>
+        <w:widowControl w:val="1"/>
+      </w:pPr>
+      <w:r>
+        <w:rPr>
+          <w:rFonts w:ascii="Times New Roman" w:hAnsi="Times New Roman" w:eastAsia="华文仿宋" w:cs="Times New Roman"/>
+          <w:color w:val="000000"/>
+        </w:rPr>
+        <w:t xml:space="preserve">匿名恢复凭据在本机独立保存，服务器保存其摘要以恢复身份；六位房间码只用于找到房间，不是身份验证凭据。当前服务端代码不将 IP 或完整操作轨迹写入持久日志，不提供聊天、语音、通讯录、广告分析或在线排行榜。队友或对手会收到您的昵称、配装、当前构筑、位置、攻击、血量及共享场景、救援状态及本场结果，不会收到恢复凭据或您的离线存档。运营者另行配置的网络代理日志以其说明为准。</w:t>
       </w:r>
     </w:p>
     <w:p>
@@ -2073,7 +2073,7 @@
           <w:rFonts w:ascii="Times New Roman" w:hAnsi="Times New Roman" w:eastAsia="华文仿宋" w:cs="Times New Roman"/>
           <w:color w:val="000000"/>
         </w:rPr>
-        <w:t xml:space="preserve">联机状态保存在您选择的服务器，具体主机地区和运营者由该服务器提供者说明。随本版本提供的服务端默认保留断线对局 90 秒、等待房间 300 秒，使用双代校验检查点恢复状态；已结束房间从运行列表释放，未再连接且不在房间中的匿名身份和战绩在 14 天后清理。已释放且不被恢复检查点引用的房间文件在最后写入满 14 天后清理。运行中的对局和恢复所需的一代备份不会提前删除。运营者自建的备份、代理日志或调整的参数需另行说明与管理。</w:t>
+        <w:t xml:space="preserve">联机状态保存在您选择的服务器，具体主机地区和运营者由该服务器提供者说明。随本版本提供的服务端默认保留断线对局 90 秒、等待房间 300 秒，使用双代校验检查点恢复状态；已结束房间从运行列表释放，未再连接且不在房间中的匿名身份和战绩在 14 天后清理。已释放且不被恢复检查点引用的房间文件在最后写入满 14 天后清理。运行中的对局和恢复所需的一代备份不会提前删除。运营者自建的备份、代理日志或调整的参数需另行说明与管理。合作暂停时双方在线则不计断线期限；有人断线后重新计时 90 秒。</w:t>
       </w:r>
     </w:p>
     <w:p>
@@ -2161,7 +2161,7 @@
           <w:rFonts w:ascii="Times New Roman" w:hAnsi="Times New Roman" w:eastAsia="华文仿宋" w:cs="Times New Roman"/>
           <w:color w:val="000000"/>
         </w:rPr>
-        <w:t xml:space="preserve">离线功能不会自动向境外传输游戏文件。对灯的传输目的地是您确认的服务器地址，其主机及网络代理可能位于其他地区；请向运营者核对位置。若我们另行向境外提供我们持有的个人信息，将事先依法说明接收方、目的、方式、类别及权利渠道，并履行所需程序，不以本政策的一般说明替代。</w:t>
+        <w:t xml:space="preserve">离线功能不会自动向境外传输游戏文件。联机的传输目的地是您确认的服务器地址，其主机及网络代理可能位于其他地区；请向运营者核对位置。若我们另行向境外提供我们持有的个人信息，将事先依法说明接收方、目的、方式、类别及权利渠道，并履行所需程序，不以本政策的一般说明替代。</w:t>
       </w:r>
     </w:p>
     <w:p>
@@ -2301,7 +2301,7 @@
           <w:rFonts w:ascii="Times New Roman" w:hAnsi="Times New Roman" w:eastAsia="华文仿宋" w:cs="Times New Roman"/>
           <w:color w:val="000000"/>
         </w:rPr>
-        <w:t xml:space="preserve">离线功能不自动发送玩家数据。对灯仅向您确认的服务器传输该模式所需信息，并向同场对手展示昵称、配装和对局状态。我们不会出售您的个人信息，也不会将您主动提供的资料用于广告投放或与广告商分享。网站托管所需请求信息由第五章列出的服务处理。</w:t>
+        <w:t xml:space="preserve">离线功能不自动发送玩家数据。联机仅向您确认的服务器传输该模式所需信息，并向同场队友或对手展示昵称、配装和对局状态。我们不会出售您的个人信息，也不会将您主动提供的资料用于广告投放或与广告商分享。网站托管所需请求信息由第五章列出的服务处理。</w:t>
       </w:r>
     </w:p>
     <w:p>
@@ -2428,7 +2428,7 @@
           <w:rFonts w:ascii="Times New Roman" w:hAnsi="Times New Roman" w:eastAsia="华文仿宋" w:cs="Times New Roman"/>
           <w:color w:val="000000"/>
         </w:rPr>
-        <w:t xml:space="preserve">当前游戏没有广告、支付、第三方账号、云分析或通用玩家统计 SDK。Godot 同时承载离线功能和您主动启用的 WebSocket 联机传输；对灯服务端独立于隐私网页的 Vercel 托管，网页不会代理或保存对战数据。</w:t>
+        <w:t xml:space="preserve">当前游戏没有广告、支付、第三方账号、云分析或通用玩家统计 SDK。Godot 同时承载离线功能和您主动启用的 WebSocket 联机传输；联机服务端独立于隐私网页的 Vercel 托管，网页不会代理或保存对战数据。</w:t>
       </w:r>
     </w:p>
     <w:tbl>
@@ -2722,7 +2722,7 @@
                 <w:b w:val="0"/>
                 <w:bCs w:val="0"/>
               </w:rPr>
-              <w:t>离线状态在本机处理；连接对灯时传输必要操作和状态</w:t>
+              <w:t>离线状态在本机处理；连接联机时传输必要操作和状态</w:t>
             </w:r>
           </w:p>
         </w:tc>
@@ -2982,7 +2982,7 @@
                 <w:b w:val="0"/>
                 <w:bCs w:val="0"/>
               </w:rPr>
-              <w:t>您选择的对灯服务器</w:t>
+              <w:t>您选择的联机服务器</w:t>
             </w:r>
           </w:p>
         </w:tc>
@@ -3200,26 +3200,26 @@
           <w:rFonts w:ascii="Times New Roman" w:hAnsi="Times New Roman" w:eastAsia="华文仿宋" w:cs="Times New Roman"/>
           <w:color w:val="000000"/>
         </w:rPr>
-        <w:t xml:space="preserve">产品使用本机应用目录、手动导入导出和校验减少离线数据损坏。对灯服务器验证内容版本、随机恢复凭据及输入序号，限制消息大小和速率，不接受客户端上传坐标、血量或胜负作为裁定。服务器保留可校验的恢复代，避免重复请求或恢复导致战绩重复。网页通过 HTTPS 提供，没有玩家资料表单。</w:t>
-      </w:r>
-    </w:p>
-    <w:p>
-      <w:pPr>
-        <w:adjustRightInd w:val="0"/>
-        <w:snapToGrid w:val="0"/>
-        <w:spacing w:before="0" w:after="156" w:afterLines="50" w:line="360" w:lineRule="auto"/>
-        <w:rPr>
-          <w:rFonts w:ascii="Times New Roman" w:hAnsi="Times New Roman" w:eastAsia="华文仿宋" w:cs="Times New Roman"/>
-          <w:color w:val="000000"/>
-        </w:rPr>
-        <w:widowControl w:val="1"/>
-      </w:pPr>
-      <w:r>
-        <w:rPr>
-          <w:rFonts w:ascii="Times New Roman" w:hAnsi="Times New Roman" w:eastAsia="华文仿宋" w:cs="Times New Roman"/>
-          <w:color w:val="000000"/>
-        </w:rPr>
-        <w:t xml:space="preserve">公网对灯连接应使用具备有效证书的 wss 地址，客户端不关闭证书验证。ws 不加密，仅适合可信本机或局域网；无法防止同网络上的通信观察。请保护设备与本机恢复凭据，不公开分享 online-client 目录。服务器使用摘要保存凭据，但检查点中的昵称、状态和战绩不是加密文件；服务器运营者应控制文件权限和备份访问。</w:t>
+        <w:t xml:space="preserve">产品使用本机应用目录、手动导入导出和校验减少离线数据损坏。联机服务器验证内容版本、随机恢复凭据及输入序号，限制消息大小和速率，不接受客户端上传坐标、血量或胜负作为裁定。服务器保留可校验的恢复代，避免重复请求或恢复导致战绩重复。网页通过 HTTPS 提供，没有玩家资料表单。</w:t>
+      </w:r>
+    </w:p>
+    <w:p>
+      <w:pPr>
+        <w:adjustRightInd w:val="0"/>
+        <w:snapToGrid w:val="0"/>
+        <w:spacing w:before="0" w:after="156" w:afterLines="50" w:line="360" w:lineRule="auto"/>
+        <w:rPr>
+          <w:rFonts w:ascii="Times New Roman" w:hAnsi="Times New Roman" w:eastAsia="华文仿宋" w:cs="Times New Roman"/>
+          <w:color w:val="000000"/>
+        </w:rPr>
+        <w:widowControl w:val="1"/>
+      </w:pPr>
+      <w:r>
+        <w:rPr>
+          <w:rFonts w:ascii="Times New Roman" w:hAnsi="Times New Roman" w:eastAsia="华文仿宋" w:cs="Times New Roman"/>
+          <w:color w:val="000000"/>
+        </w:rPr>
+        <w:t xml:space="preserve">公网联机连接应使用具备有效证书的 wss 地址，客户端不关闭证书验证。ws 不加密，仅适合可信本机或局域网；无法防止同网络上的通信观察。请保护设备与本机恢复凭据，不公开分享 online-client 目录。服务器使用摘要保存凭据，但检查点中的昵称、状态和战绩不是加密文件；服务器运营者应控制文件权限和备份访问。</w:t>
       </w:r>
     </w:p>
     <w:p>
@@ -3426,7 +3426,7 @@
           <w:rFonts w:ascii="Times New Roman" w:hAnsi="Times New Roman" w:eastAsia="华文仿宋" w:cs="Times New Roman"/>
           <w:color w:val="000000"/>
         </w:rPr>
-        <w:t xml:space="preserve">我们无法远程读取、删除或恢复未提交给我们的离线文件。清除 online-client 可删除本机联机身份、配置和恢复凭据，但不会删除服务器已有的昵称或战绩，并会失去原身份的恢复能力。对灯大厅可查看最近服务器战绩；需查阅、更正或删除服务端资料时，请联系所选服务器的运营者，说明服务器地址和当前匿名身份，以最少必要信息核验。服务由我们运营时可使用第十章邮箱；不要公开发送恢复密钥。</w:t>
+        <w:t xml:space="preserve">我们无法远程读取、删除或恢复未提交给我们的离线文件。清除 online-client 可删除本机联机身份、配置和恢复凭据，但不会删除服务器已有的昵称或战绩，并会失去原身份的恢复能力。联机大厅可查看最近服务器战绩；需查阅、更正或删除服务端资料时，请联系所选服务器的运营者，说明服务器地址和当前匿名身份，以最少必要信息核验。服务由我们运营时可使用第十章邮箱；不要公开发送恢复密钥。</w:t>
       </w:r>
     </w:p>
     <w:p>
@@ -3475,7 +3475,7 @@
           <w:rFonts w:ascii="Times New Roman" w:hAnsi="Times New Roman" w:eastAsia="华文仿宋" w:cs="Times New Roman"/>
           <w:color w:val="000000"/>
         </w:rPr>
-        <w:t xml:space="preserve">您可以不填写识别身份的愿名或联机昵称、不使用剪贴板或导入导出、关闭触觉反馈、拒绝连接服务器、退出对灯并继续离线游玩。退出会停止该连接的数据传输；服务器已有资料按其保存和删除规则处理。当前没有手机号或密码注册账号；本机匿名身份的删除方式见上文，服务端删除需向对应运营者申请。撤回不影响撤回前依法开展的处理。</w:t>
+        <w:t xml:space="preserve">您可以不填写识别身份的愿名或联机昵称、不使用剪贴板或导入导出、关闭触觉反馈、拒绝连接服务器、退出联机并继续离线游玩。退出会停止该连接的数据传输；服务器已有资料按其保存和删除规则处理。当前没有手机号或密码注册账号；本机匿名身份的删除方式见上文，服务端删除需向对应运营者申请。撤回不影响撤回前依法开展的处理。</w:t>
       </w:r>
     </w:p>
     <w:p>
@@ -3594,7 +3594,7 @@
           <w:rFonts w:ascii="Times New Roman" w:hAnsi="Times New Roman" w:eastAsia="华文仿宋" w:cs="Times New Roman"/>
           <w:color w:val="000000"/>
         </w:rPr>
-        <w:t xml:space="preserve">不满十四周岁未成年人的个人信息需要严格保护。客户端不通过生日或身份证识别年龄；离线模式不自动向我们提交信息。请监护人协助管理昵称、文件分享，并在同意连接对灯服务器前阅读其信息处理说明。服务器不设年龄识别或监护关系收集接口，不应通过昵称提交儿童真实姓名、学校或联系方式。</w:t>
+        <w:t xml:space="preserve">不满十四周岁未成年人的个人信息需要严格保护。客户端不通过生日或身份证识别年龄；离线模式不自动向我们提交信息。请监护人协助管理昵称、文件分享，并在同意连接联机服务器前阅读其信息处理说明。服务器不设年龄识别或监护关系收集接口，不应通过昵称提交儿童真实姓名、学校或联系方式。</w:t>
       </w:r>
     </w:p>
     <w:p>
@@ -3683,7 +3683,7 @@
           <w:rFonts w:ascii="Times New Roman" w:hAnsi="Times New Roman" w:eastAsia="华文仿宋" w:cs="Times New Roman"/>
           <w:color w:val="000000"/>
         </w:rPr>
-        <w:t xml:space="preserve">我们会公布更新版本、日期和适用范围。0.3.0 新增由您确认后启用的对灯联机及 Android 联网权限，本政策为此补充信息种类、目的地、显示范围、恢复凭据、保存和删除规则；旧版离线客户端按对应历史政策说明。后续新增其他处理功能将先补充告知，不依据一般条款直接开展新的收集。</w:t>
+        <w:t xml:space="preserve">0.4.0 新增双人合作闯关，本次补充共享场景、怪物、掉落、成长、救援及合作结果的处理说明；对战模式仍可选。旧版客户端适用对应历史政策。后续新增处理功能时将先补充告知。</w:t>
       </w:r>
     </w:p>
     <w:p>
@@ -3721,7 +3721,7 @@
           <w:rFonts w:ascii="Times New Roman" w:hAnsi="Times New Roman" w:eastAsia="华文仿宋" w:cs="Times New Roman"/>
           <w:color w:val="000000"/>
         </w:rPr>
-        <w:t xml:space="preserve">本政策文字不会自行改变旧版客户端功能。我们保留已公开的历史文本供查询。当前为版本 1.4，本次补充可选对灯模式的信息处理说明，运营主体继续为 吴国黎，与应用资料页保持一致。</w:t>
+        <w:t xml:space="preserve">本政策文字不会自行改变旧版客户端功能。我们保留已公开的历史文本供查询。当前为版本 1.5，本次补充可选合作闯关的信息处理说明，运营主体继续为 吴国黎，与应用资料页保持一致。</w:t>
       </w:r>
     </w:p>
     <w:p>

</xml_diff>

<commit_message>
Ship official automatic co-op with signed 0.5.0 clients and WAN evidence
</commit_message>
<xml_diff>
--- a/output/legal/incense-debt-privacy-policy-2026-10-11.docx
+++ b/output/legal/incense-debt-privacy-policy-2026-10-11.docx
@@ -44,26 +44,26 @@
           <w:rFonts w:ascii="Times New Roman" w:hAnsi="Times New Roman" w:eastAsia="华文仿宋" w:cs="Times New Roman"/>
           <w:color w:val="000000"/>
         </w:rPr>
-        <w:t xml:space="preserve">1. 《香火债》可离线单人游玩，也提供由您主动连接的双人合作闯关及联机切磋模式。无需手机号或实名注册。Android 0.4.0 申请联网和振动普通权限；离线模式不会自动上传愿簿、成就或单人进度。</w:t>
-      </w:r>
-    </w:p>
-    <w:p>
-      <w:pPr>
-        <w:adjustRightInd w:val="0"/>
-        <w:snapToGrid w:val="0"/>
-        <w:spacing w:before="0" w:after="156" w:afterLines="50" w:line="360" w:lineRule="auto"/>
-        <w:rPr>
-          <w:rFonts w:ascii="Times New Roman" w:hAnsi="Times New Roman" w:eastAsia="华文仿宋" w:cs="Times New Roman"/>
-          <w:color w:val="000000"/>
-        </w:rPr>
-        <w:widowControl w:val="1"/>
-      </w:pPr>
-      <w:r>
-        <w:rPr>
-          <w:rFonts w:ascii="Times New Roman" w:hAnsi="Times New Roman" w:eastAsia="华文仿宋" w:cs="Times New Roman"/>
-          <w:color w:val="000000"/>
-        </w:rPr>
-        <w:t xml:space="preserve">2. 首次连接每个服务器前，游戏说明信息处理范围并由您确认。联机会向您选择的服务器发送匿名联机身份、昵称、配装、房间及操作信息，用于匹配、战斗裁定、断线恢复和战绩。队友或对手可看到昵称、配装及对局状态；请勿填写真实身份信息。</w:t>
+        <w:t xml:space="preserve">1. 《香火债》可离线单人游玩，也提供由您主动进入的双人合作闯关及联机切磋模式。无需手机号或实名注册。Android 0.5.0 申请联网和振动普通权限；离线模式不会自动上传愿簿、成就或单人进度。</w:t>
+      </w:r>
+    </w:p>
+    <w:p>
+      <w:pPr>
+        <w:adjustRightInd w:val="0"/>
+        <w:snapToGrid w:val="0"/>
+        <w:spacing w:before="0" w:after="156" w:afterLines="50" w:line="360" w:lineRule="auto"/>
+        <w:rPr>
+          <w:rFonts w:ascii="Times New Roman" w:hAnsi="Times New Roman" w:eastAsia="华文仿宋" w:cs="Times New Roman"/>
+          <w:color w:val="000000"/>
+        </w:rPr>
+        <w:widowControl w:val="1"/>
+      </w:pPr>
+      <w:r>
+        <w:rPr>
+          <w:rFonts w:ascii="Times New Roman" w:hAnsi="Times New Roman" w:eastAsia="华文仿宋" w:cs="Times New Roman"/>
+          <w:color w:val="000000"/>
+        </w:rPr>
+        <w:t xml:space="preserve">2. 主菜单在共灯入口旁说明：官方服务位于新加坡，会传输昵称、匿名身份及游玩操作。您点击共灯后自动连接，断线期间自动重试；退出联机即停止连接。运营者为 吴国黎，隐私联系邮箱 carzyg@outlook.com。联机处理仅用于匹配、战斗裁定、断线恢复及战绩；队友或对手可看到昵称、配装及对局状态。请勿填写真实身份信息。</w:t>
       </w:r>
     </w:p>
     <w:p>
@@ -250,7 +250,7 @@
           <w:rFonts w:ascii="Times New Roman" w:hAnsi="Times New Roman" w:eastAsia="华文仿宋" w:cs="Times New Roman"/>
           <w:color w:val="000000"/>
         </w:rPr>
-        <w:t xml:space="preserve">政策版本：1.5；适用范围：Windows 与 Android 客户端 0.4.0 的离线模式、可选共灯合作闯关和对灯切磋模式，以及本隐私政策展示网页；旧版客户端请参阅对应历史政策。</w:t>
+        <w:t xml:space="preserve">政策版本：1.6；适用范围：Windows 与 Android 客户端 0.5.0 的离线模式、可选官方共灯合作与对灯切磋，以及本隐私政策网页；旧版客户端适用对应历史政策。</w:t>
       </w:r>
     </w:p>
     <w:p>
@@ -728,7 +728,7 @@
           <w:rFonts w:ascii="Times New Roman" w:hAnsi="Times New Roman" w:eastAsia="华文仿宋" w:cs="Times New Roman"/>
           <w:color w:val="000000"/>
         </w:rPr>
-        <w:t xml:space="preserve">Android 0.4.0 声明联网和振动普通权限，没有定位、通讯录、相机、麦克风、照片或广泛外部存储权限。联网仅在您进入联机并主动连接所选服务器时用于该功能；拒绝连接不影响离线模式。剪贴板和文件选择不等同于申请 Android 危险权限。</w:t>
+        <w:t xml:space="preserve">Android 0.5.0 声明联网和振动普通权限，没有定位、通讯录、相机、麦克风、照片或广泛外部存储权限。联网在您主动进入共灯后自动启用；离开联机会停止连接及重试，不进入联机不影响离线模式。剪贴板和文件选择不等同于申请 Android 危险权限。</w:t>
       </w:r>
     </w:p>
     <w:tbl>
@@ -1915,7 +1915,7 @@
           <w:rFonts w:ascii="Times New Roman" w:hAnsi="Times New Roman" w:eastAsia="华文仿宋" w:cs="Times New Roman"/>
           <w:color w:val="000000"/>
         </w:rPr>
-        <w:t xml:space="preserve">客户端默认地址为本机测试地址，您可以填写自己或他人提供的服务器地址。同一联机房间的两人需连接同一服务器。首次连接该地址前，客户端展示地址和信息处理范围，由您确认后连接；返回可取消。当前不提供预设的公共联机运营服务器。您选择其他运营者的服务时，请核对其主体、地区、隐私政策与联系方式。</w:t>
+        <w:t xml:space="preserve">0.5.0 使用固定的官方服务，由 吴国黎 运营，运行于腾讯云新加坡区域的主机。联机界面不展示或提供修改服务器地址的功能。主菜单入口在连接前说明处理类别、境外所在地及退出方式，您点击可选共灯入口后自动建立加密连接；普通网络中断时按退避间隔自动重试，不在断线期间继续裁定战斗。身份失效或版本不匹配时提示您处理，不会擅自替换身份。</w:t>
       </w:r>
     </w:p>
     <w:p>
@@ -1953,7 +1953,7 @@
           <w:rFonts w:ascii="Times New Roman" w:hAnsi="Times New Roman" w:eastAsia="华文仿宋" w:cs="Times New Roman"/>
           <w:color w:val="000000"/>
         </w:rPr>
-        <w:t xml:space="preserve">匿名恢复凭据在本机独立保存，服务器保存其摘要以恢复身份；六位房间码只用于找到房间，不是身份验证凭据。当前服务端代码不将 IP 或完整操作轨迹写入持久日志，不提供聊天、语音、通讯录、广告分析或在线排行榜。队友或对手会收到您的昵称、配装、当前构筑、位置、攻击、血量及共享场景、救援状态及本场结果，不会收到恢复凭据或您的离线存档。运营者另行配置的网络代理日志以其说明为准。</w:t>
+        <w:t xml:space="preserve">匿名恢复凭据在本机独立保存，服务器保存其摘要以恢复身份；六位房间码只用于找到房间，不是身份验证凭据。当前服务端代码不将 IP 或完整操作轨迹写入持久日志，不提供聊天、语音、通讯录、广告分析或在线排行榜。队友或对手会收到您的昵称、配装、当前构筑、位置、攻击、血量及共享场景、救援状态及本场结果，不会收到恢复凭据或您的离线存档。官方站点和联机代理不记录访问日志；错误日志仅用于运行故障排查，可能包含连接 IP，不记录完整操作轨迹或恢复密钥。</w:t>
       </w:r>
     </w:p>
     <w:p>
@@ -2035,7 +2035,7 @@
           <w:rFonts w:ascii="Times New Roman" w:hAnsi="Times New Roman" w:eastAsia="华文仿宋" w:cs="Times New Roman"/>
           <w:color w:val="000000"/>
         </w:rPr>
-        <w:t xml:space="preserve">离线存档、设置、游玩日志及联机客户端配置保存在您的设备上。Windows 默认位置为 %APPDATA%\IncenseDebt；Android 使用应用数据目录。联机身份、恢复凭据、所选地址、昵称、配装、待确认请求和最近显示的战绩使用独立 online-client 目录，并按服务器地址区分，最多保留八个地址。单人三槽存档与联机身份分开保存。</w:t>
+        <w:t xml:space="preserve">离线存档、设置、游玩日志及联机配置保存在您的设备上。Windows 默认位置为 %APPDATA%\IncenseDebt；Android 使用应用数据目录。匿名联机身份、恢复凭据、昵称、配装、待确认请求和最近显示的战绩使用独立 online-client 目录。旧版保存的地址不会改变 0.5.0 的官方连接。单人三槽存档与联机身份分开保存。</w:t>
       </w:r>
     </w:p>
     <w:p>
@@ -2073,7 +2073,7 @@
           <w:rFonts w:ascii="Times New Roman" w:hAnsi="Times New Roman" w:eastAsia="华文仿宋" w:cs="Times New Roman"/>
           <w:color w:val="000000"/>
         </w:rPr>
-        <w:t xml:space="preserve">联机状态保存在您选择的服务器，具体主机地区和运营者由该服务器提供者说明。随本版本提供的服务端默认保留断线对局 90 秒、等待房间 300 秒，使用双代校验检查点恢复状态；已结束房间从运行列表释放，未再连接且不在房间中的匿名身份和战绩在 14 天后清理。已释放且不被恢复检查点引用的房间文件在最后写入满 14 天后清理。运行中的对局和恢复所需的一代备份不会提前删除。运营者自建的备份、代理日志或调整的参数需另行说明与管理。合作暂停时双方在线则不计断线期限；有人断线后重新计时 90 秒。</w:t>
+        <w:t xml:space="preserve">官方联机状态保存在腾讯云新加坡主机，由 吴国黎 管理。官方服务保留断线对局 90 秒、等待房间 300 秒，使用双代校验检查点恢复状态；已结束房间从运行列表释放，未再连接且不在房间中的匿名身份和战绩在 14 天后清理。已释放且不被恢复检查点引用的房间文件在最后写入满 14 天后清理。运行中的对局和恢复所需的一代备份不会提前删除。恢复检查点及身份文件仅限服务账号访问；不用于广告画像。代理故障日志滚动清理，最长保留 14 天。合作暂停时双方在线则不计断线期限；有人断线后重新计时 90 秒。</w:t>
       </w:r>
     </w:p>
     <w:p>
@@ -2161,7 +2161,7 @@
           <w:rFonts w:ascii="Times New Roman" w:hAnsi="Times New Roman" w:eastAsia="华文仿宋" w:cs="Times New Roman"/>
           <w:color w:val="000000"/>
         </w:rPr>
-        <w:t xml:space="preserve">离线功能不会自动向境外传输游戏文件。联机的传输目的地是您确认的服务器地址，其主机及网络代理可能位于其他地区；请向运营者核对位置。若我们另行向境外提供我们持有的个人信息，将事先依法说明接收方、目的、方式、类别及权利渠道，并履行所需程序，不以本政策的一般说明替代。</w:t>
+        <w:t xml:space="preserve">离线游玩不会自动向境外传输游戏文件。您主动进入共灯后，联机所需昵称、匿名身份、配装、房间及操作状态、连接 IP 由 吴国黎 管理的新加坡官方主机处理，用于本政策第一章说明的匹配、战斗、恢复和战绩；不会传输您的离线愿簿。腾讯云提供基础设施托管，不向队友或对手公开恢复凭据。您可退出联机停止传输，或通过 carzyg@outlook.com 申请查阅、更正、删除服务端资料。新增境外接收方或改变用途时将另行告知，并依法履行所需程序。</w:t>
       </w:r>
     </w:p>
     <w:p>
@@ -2301,7 +2301,7 @@
           <w:rFonts w:ascii="Times New Roman" w:hAnsi="Times New Roman" w:eastAsia="华文仿宋" w:cs="Times New Roman"/>
           <w:color w:val="000000"/>
         </w:rPr>
-        <w:t xml:space="preserve">离线功能不自动发送玩家数据。联机仅向您确认的服务器传输该模式所需信息，并向同场队友或对手展示昵称、配装和对局状态。我们不会出售您的个人信息，也不会将您主动提供的资料用于广告投放或与广告商分享。网站托管所需请求信息由第五章列出的服务处理。</w:t>
+        <w:t xml:space="preserve">离线功能不自动发送玩家数据。联机仅向您主动启用的官方联机服务传输该模式所需信息，并向同场队友或对手展示昵称、配装和对局状态。我们不会出售您的个人信息，也不会将您主动提供的资料用于广告投放或与广告商分享。网站托管所需请求信息由第五章列出的服务处理。</w:t>
       </w:r>
     </w:p>
     <w:p>
@@ -2982,7 +2982,7 @@
                 <w:b w:val="0"/>
                 <w:bCs w:val="0"/>
               </w:rPr>
-              <w:t>您选择的联机服务器</w:t>
+              <w:t>官方联机服务及腾讯云主机</w:t>
             </w:r>
           </w:p>
         </w:tc>
@@ -3052,7 +3052,7 @@
                 <w:b w:val="0"/>
                 <w:bCs w:val="0"/>
               </w:rPr>
-              <w:t>匿名身份、昵称、配装、房间、操作及对局状态</w:t>
+              <w:t>昵称、匿名身份、配装、房间、操作及对局状态；连接 IP</w:t>
             </w:r>
           </w:p>
         </w:tc>
@@ -3089,7 +3089,7 @@
                 <w:b w:val="0"/>
                 <w:bCs w:val="0"/>
               </w:rPr>
-              <w:t>地址由您确认；运营者、地区和政策由服务器提供者说明</w:t>
+              <w:t>吴国黎 运营；腾讯云新加坡主机托管；https://cloud.tencent.com/document/product/301/11488</w:t>
             </w:r>
           </w:p>
         </w:tc>
@@ -3219,7 +3219,7 @@
           <w:rFonts w:ascii="Times New Roman" w:hAnsi="Times New Roman" w:eastAsia="华文仿宋" w:cs="Times New Roman"/>
           <w:color w:val="000000"/>
         </w:rPr>
-        <w:t xml:space="preserve">公网联机连接应使用具备有效证书的 wss 地址，客户端不关闭证书验证。ws 不加密，仅适合可信本机或局域网；无法防止同网络上的通信观察。请保护设备与本机恢复凭据，不公开分享 online-client 目录。服务器使用摘要保存凭据，但检查点中的昵称、状态和战绩不是加密文件；服务器运营者应控制文件权限和备份访问。</w:t>
+        <w:t xml:space="preserve">官方客户端使用有效证书的 WSS 加密连接，保留证书和域名验证。服务端游戏端口仅监听主机回环地址，经 HTTPS 代理提供联机入口。请保护设备和本机恢复凭据，不公开分享 online-client 目录。服务器使用摘要保存凭据，检查点文件设置访问权限；这些文件并非另行加密，管理者需要持续保护主机及备份。</w:t>
       </w:r>
     </w:p>
     <w:p>
@@ -3426,7 +3426,7 @@
           <w:rFonts w:ascii="Times New Roman" w:hAnsi="Times New Roman" w:eastAsia="华文仿宋" w:cs="Times New Roman"/>
           <w:color w:val="000000"/>
         </w:rPr>
-        <w:t xml:space="preserve">我们无法远程读取、删除或恢复未提交给我们的离线文件。清除 online-client 可删除本机联机身份、配置和恢复凭据，但不会删除服务器已有的昵称或战绩，并会失去原身份的恢复能力。联机大厅可查看最近服务器战绩；需查阅、更正或删除服务端资料时，请联系所选服务器的运营者，说明服务器地址和当前匿名身份，以最少必要信息核验。服务由我们运营时可使用第十章邮箱；不要公开发送恢复密钥。</w:t>
+        <w:t xml:space="preserve">我们无法远程读取、删除或恢复未提交给我们的离线文件。清除 online-client 可删除本机联机身份、配置和恢复凭据，但不会自动删除服务器已有昵称或战绩，并会失去原身份的恢复能力。联机大厅可查看当前身份的战绩；查阅、更正或删除官方资料请联系 carzyg@outlook.com，说明昵称、客户端版本、必要的房间或时间信息，以最少必要信息核验。不要公开发送恢复密钥。</w:t>
       </w:r>
     </w:p>
     <w:p>
@@ -3475,7 +3475,7 @@
           <w:rFonts w:ascii="Times New Roman" w:hAnsi="Times New Roman" w:eastAsia="华文仿宋" w:cs="Times New Roman"/>
           <w:color w:val="000000"/>
         </w:rPr>
-        <w:t xml:space="preserve">您可以不填写识别身份的愿名或联机昵称、不使用剪贴板或导入导出、关闭触觉反馈、拒绝连接服务器、退出联机并继续离线游玩。退出会停止该连接的数据传输；服务器已有资料按其保存和删除规则处理。当前没有手机号或密码注册账号；本机匿名身份的删除方式见上文，服务端删除需向对应运营者申请。撤回不影响撤回前依法开展的处理。</w:t>
+        <w:t xml:space="preserve">您可以不填写识别身份的愿名或联机昵称、不使用剪贴板或导入导出、关闭触觉反馈、不进入共灯、退出联机并继续离线游玩。退出会停止该连接的数据传输；服务器已有资料按本政策的保存和删除规则处理。当前没有手机号或密码注册账号；本机匿名身份的删除方式见上文，服务端删除需向我们申请。撤回不影响撤回前依法开展的处理。</w:t>
       </w:r>
     </w:p>
     <w:p>
@@ -3683,7 +3683,7 @@
           <w:rFonts w:ascii="Times New Roman" w:hAnsi="Times New Roman" w:eastAsia="华文仿宋" w:cs="Times New Roman"/>
           <w:color w:val="000000"/>
         </w:rPr>
-        <w:t xml:space="preserve">0.4.0 新增双人合作闯关，本次补充共享场景、怪物、掉落、成长、救援及合作结果的处理说明；对战模式仍可选。旧版客户端适用对应历史政策。后续新增处理功能时将先补充告知。</w:t>
+        <w:t xml:space="preserve">0.5.0 启用固定官方公网服务，主菜单说明新加坡处理位置和必要的信息类别；进入联机后自动连接，普通断线自动重试。本次同步补充官方运营主体、托管位置、保存期限及权利渠道。旧版客户端适用对应历史政策。</w:t>
       </w:r>
     </w:p>
     <w:p>
@@ -3715,13 +3715,14 @@
           <w:color w:val="000000"/>
         </w:rPr>
         <w:widowControl w:val="1"/>
-      </w:pPr>
-      <w:r>
-        <w:rPr>
-          <w:rFonts w:ascii="Times New Roman" w:hAnsi="Times New Roman" w:eastAsia="华文仿宋" w:cs="Times New Roman"/>
-          <w:color w:val="000000"/>
-        </w:rPr>
-        <w:t xml:space="preserve">本政策文字不会自行改变旧版客户端功能。我们保留已公开的历史文本供查询。当前为版本 1.5，本次补充可选合作闯关的信息处理说明，运营主体继续为 吴国黎，与应用资料页保持一致。</w:t>
+        <w:jc w:val="left"/>
+      </w:pPr>
+      <w:r>
+        <w:rPr>
+          <w:rFonts w:ascii="Times New Roman" w:hAnsi="Times New Roman" w:eastAsia="华文仿宋" w:cs="Times New Roman"/>
+          <w:color w:val="000000"/>
+        </w:rPr>
+        <w:t xml:space="preserve">本政策文字不会自行改变旧版功能。我们保留已公开历史文本供查询。当前为版本 1.6，运营主体继续为 吴国黎，与应用资料页保持一致。1.5 历史文本可在 https://xhz.sidcloud.cn/versions/2026-10-11-v1.5 查询。</w:t>
       </w:r>
     </w:p>
     <w:p>

</xml_diff>